<commit_message>
Publicar web 2026-10-14 v2
</commit_message>
<xml_diff>
--- a/assets/docs/plantilla-resumen-6to-simposio-redlev-2026.docx
+++ b/assets/docs/plantilla-resumen-6to-simposio-redlev-2026.docx
@@ -2,54 +2,162 @@
 <file path=word/document.xml><?xml version="1.0" encoding="utf-8"?>
 <w:document xmlns:wpc="http://schemas.microsoft.com/office/word/2010/wordprocessingCanvas" xmlns:mc="http://schemas.openxmlformats.org/markup-compatibility/2006" xmlns:o="urn:schemas-microsoft-com:office:office" xmlns:r="http://schemas.openxmlformats.org/officeDocument/2006/relationships" xmlns:m="http://schemas.openxmlformats.org/officeDocument/2006/math" xmlns:v="urn:schemas-microsoft-com:vml" xmlns:wp14="http://schemas.microsoft.com/office/word/2010/wordprocessingDrawing" xmlns:wp="http://schemas.openxmlformats.org/drawingml/2006/wordprocessingDrawing" xmlns:w10="urn:schemas-microsoft-com:office:word" xmlns:w="http://schemas.openxmlformats.org/wordprocessingml/2006/main" xmlns:w14="http://schemas.microsoft.com/office/word/2010/wordml" xmlns:w15="http://schemas.microsoft.com/office/word/2012/wordml" xmlns:wpg="http://schemas.microsoft.com/office/word/2010/wordprocessingGroup" xmlns:wpi="http://schemas.microsoft.com/office/word/2010/wordprocessingInk" xmlns:wne="http://schemas.microsoft.com/office/word/2006/wordml" xmlns:wps="http://schemas.microsoft.com/office/word/2010/wordprocessingShape" xmlns:cx="http://schemas.microsoft.com/office/drawing/2014/chartex" xmlns:cx1="http://schemas.microsoft.com/office/drawing/2015/9/8/chartex" xmlns:cx2="http://schemas.microsoft.com/office/drawing/2015/10/21/chartex" xmlns:cx3="http://schemas.microsoft.com/office/drawing/2016/5/9/chartex" xmlns:cx4="http://schemas.microsoft.com/office/drawing/2016/5/10/chartex" xmlns:cx5="http://schemas.microsoft.com/office/drawing/2016/5/11/chartex" xmlns:cx6="http://schemas.microsoft.com/office/drawing/2016/5/12/chartex" xmlns:cx7="http://schemas.microsoft.com/office/drawing/2016/5/13/chartex" xmlns:cx8="http://schemas.microsoft.com/office/drawing/2016/5/14/chartex" xmlns:aink="http://schemas.microsoft.com/office/drawing/2016/ink" xmlns:am3d="http://schemas.microsoft.com/office/drawing/2017/model3d" xmlns:w16cex="http://schemas.microsoft.com/office/word/2018/wordml/cex" xmlns:w16cid="http://schemas.microsoft.com/office/word/2016/wordml/cid" xmlns:w16="http://schemas.microsoft.com/office/word/2018/wordml" xmlns:w16sdtdh="http://schemas.microsoft.com/office/word/2020/wordml/sdtdatahash" xmlns:w16se="http://schemas.microsoft.com/office/word/2015/wordml/symex" mc:Ignorable="w14 w15 wp14">
   <w:body>
+    <w:tbl>
+      <w:tblPr>
+        <w:tblW w:type="dxa" w:w="9638"/>
+        <w:tblBorders>
+          <w:top w:val="single" w:color="auto" w:sz="4"/>
+          <w:left w:val="single" w:color="auto" w:sz="4"/>
+          <w:bottom w:val="single" w:color="auto" w:sz="4"/>
+          <w:right w:val="single" w:color="auto" w:sz="4"/>
+          <w:insideH w:val="single" w:color="auto" w:sz="4"/>
+          <w:insideV w:val="single" w:color="auto" w:sz="4"/>
+        </w:tblBorders>
+      </w:tblPr>
+      <w:tblGrid>
+        <w:gridCol w:w="3300"/>
+        <w:gridCol w:w="6338"/>
+      </w:tblGrid>
+      <w:tr>
+        <w:tc>
+          <w:tcPr>
+            <w:tcW w:type="dxa" w:w="3300"/>
+            <w:tcBorders>
+              <w:top w:val="single" w:color="012147" w:sz="4"/>
+              <w:left w:val="single" w:color="012147" w:sz="4"/>
+              <w:bottom w:val="single" w:color="012147" w:sz="4"/>
+              <w:right w:val="single" w:color="012147" w:sz="4"/>
+            </w:tcBorders>
+            <w:shd w:fill="012147" w:color="auto" w:val="clear"/>
+            <w:tcMar>
+              <w:top w:type="dxa" w:w="160"/>
+              <w:left w:type="dxa" w:w="200"/>
+              <w:bottom w:type="dxa" w:w="160"/>
+              <w:right w:type="dxa" w:w="120"/>
+            </w:tcMar>
+            <w:vAlign w:val="center"/>
+          </w:tcPr>
+          <w:p>
+            <w:r>
+              <w:drawing>
+                <wp:inline distT="0" distB="0" distL="0" distR="0">
+                  <wp:extent cx="1771650" cy="990600"/>
+                  <wp:effectExtent t="0" r="0" b="0" l="0"/>
+                  <wp:docPr id="1" name="logo-redlev" descr="Logo de la Red Latinoamericana de Ecofisiología Vegetal" title="Logo REDLEV"/>
+                  <wp:cNvGraphicFramePr>
+                    <a:graphicFrameLocks xmlns:a="http://schemas.openxmlformats.org/drawingml/2006/main" noChangeAspect="1"/>
+                  </wp:cNvGraphicFramePr>
+                  <a:graphic xmlns:a="http://schemas.openxmlformats.org/drawingml/2006/main">
+                    <a:graphicData uri="http://schemas.openxmlformats.org/drawingml/2006/picture">
+                      <pic:pic xmlns:pic="http://schemas.openxmlformats.org/drawingml/2006/picture">
+                        <pic:nvPicPr>
+                          <pic:cNvPr id="0" name="" descr=""/>
+                          <pic:cNvPicPr>
+                            <a:picLocks noChangeAspect="1" noChangeArrowheads="1"/>
+                          </pic:cNvPicPr>
+                        </pic:nvPicPr>
+                        <pic:blipFill>
+                          <a:blip r:embed="rId8" cstate="none"/>
+                          <a:srcRect/>
+                          <a:stretch>
+                            <a:fillRect/>
+                          </a:stretch>
+                        </pic:blipFill>
+                        <pic:spPr bwMode="auto">
+                          <a:xfrm>
+                            <a:off x="0" y="0"/>
+                            <a:ext cx="1771650" cy="990600"/>
+                          </a:xfrm>
+                          <a:prstGeom prst="rect">
+                            <a:avLst/>
+                          </a:prstGeom>
+                        </pic:spPr>
+                      </pic:pic>
+                    </a:graphicData>
+                  </a:graphic>
+                </wp:inline>
+              </w:drawing>
+            </w:r>
+          </w:p>
+        </w:tc>
+        <w:tc>
+          <w:tcPr>
+            <w:tcW w:type="dxa" w:w="6338"/>
+            <w:tcBorders>
+              <w:top w:val="single" w:color="012147" w:sz="4"/>
+              <w:left w:val="single" w:color="012147" w:sz="4"/>
+              <w:bottom w:val="single" w:color="012147" w:sz="4"/>
+              <w:right w:val="single" w:color="012147" w:sz="4"/>
+            </w:tcBorders>
+            <w:shd w:fill="012147" w:color="auto" w:val="clear"/>
+            <w:tcMar>
+              <w:top w:type="dxa" w:w="160"/>
+              <w:left w:type="dxa" w:w="120"/>
+              <w:bottom w:type="dxa" w:w="160"/>
+              <w:right w:type="dxa" w:w="240"/>
+            </w:tcMar>
+            <w:vAlign w:val="center"/>
+          </w:tcPr>
+          <w:p>
+            <w:pPr>
+              <w:spacing w:after="60"/>
+            </w:pPr>
+            <w:r>
+              <w:rPr>
+                <w:rFonts w:ascii="Arial" w:cs="Arial" w:eastAsia="Arial" w:hAnsi="Arial"/>
+                <w:b/>
+                <w:bCs/>
+                <w:color w:val="FFFFFF"/>
+                <w:sz w:val="26"/>
+                <w:szCs w:val="26"/>
+              </w:rPr>
+              <w:t xml:space="preserve">6to Simposio Latinoamericano de Ecofisiología Vegetal</w:t>
+            </w:r>
+          </w:p>
+          <w:p>
+            <w:pPr>
+              <w:spacing w:after="120"/>
+            </w:pPr>
+            <w:r>
+              <w:rPr>
+                <w:rFonts w:ascii="Arial" w:cs="Arial" w:eastAsia="Arial" w:hAnsi="Arial"/>
+                <w:b/>
+                <w:bCs/>
+                <w:color w:val="FFB000"/>
+                <w:sz w:val="20"/>
+                <w:szCs w:val="20"/>
+              </w:rPr>
+              <w:t xml:space="preserve">Jueves 19 de noviembre de 2026 · En línea por Zoom</w:t>
+            </w:r>
+          </w:p>
+          <w:p>
+            <w:pPr>
+              <w:spacing w:after="0"/>
+            </w:pPr>
+            <w:r>
+              <w:rPr>
+                <w:rFonts w:ascii="Arial" w:cs="Arial" w:eastAsia="Arial" w:hAnsi="Arial"/>
+                <w:color w:val="FFFFFF"/>
+                <w:sz w:val="22"/>
+                <w:szCs w:val="22"/>
+              </w:rPr>
+              <w:t xml:space="preserve">Plantilla para el envío de resúmenes</w:t>
+            </w:r>
+          </w:p>
+        </w:tc>
+      </w:tr>
+    </w:tbl>
     <w:p>
       <w:pPr>
-        <w:spacing w:after="40"/>
+        <w:spacing w:after="120"/>
       </w:pPr>
       <w:r>
         <w:rPr>
           <w:rFonts w:ascii="Arial" w:cs="Arial" w:eastAsia="Arial" w:hAnsi="Arial"/>
-          <w:b/>
-          <w:bCs/>
-          <w:color w:val="003060"/>
-          <w:sz w:val="30"/>
-          <w:szCs w:val="30"/>
-        </w:rPr>
-        <w:t xml:space="preserve">6to Simposio Latinoamericano de Ecofisiología Vegetal</w:t>
-      </w:r>
-    </w:p>
-    <w:p>
-      <w:pPr>
-        <w:spacing w:after="160"/>
-      </w:pPr>
-      <w:r>
-        <w:rPr>
-          <w:rFonts w:ascii="Arial" w:cs="Arial" w:eastAsia="Arial" w:hAnsi="Arial"/>
-          <w:b/>
-          <w:bCs/>
-          <w:color w:val="007020"/>
           <w:sz w:val="22"/>
           <w:szCs w:val="22"/>
         </w:rPr>
-        <w:t xml:space="preserve">Jueves 19 de noviembre de 2026 · En línea por Zoom</w:t>
-      </w:r>
-    </w:p>
-    <w:p>
-      <w:pPr>
-        <w:pBdr>
-          <w:bottom w:val="single" w:color="FFB000" w:sz="12" w:space="4"/>
-        </w:pBdr>
-        <w:spacing w:after="160"/>
-      </w:pPr>
-      <w:r>
-        <w:rPr>
-          <w:rFonts w:ascii="Arial" w:cs="Arial" w:eastAsia="Arial" w:hAnsi="Arial"/>
-          <w:b/>
-          <w:bCs/>
-          <w:sz w:val="26"/>
-          <w:szCs w:val="26"/>
-        </w:rPr>
-        <w:t xml:space="preserve">Plantilla para el envío de resúmenes</w:t>
+        <w:t xml:space="preserve"/>
       </w:r>
     </w:p>
     <w:tbl>
@@ -719,7 +827,7 @@
                 <w:sz w:val="22"/>
                 <w:szCs w:val="22"/>
               </w:rPr>
-              <w:t xml:space="preserve"> · sesión de la mañana: bloques A y B, 10:00–12:00 h (Panamá, UTC−5)</w:t>
+              <w:t xml:space="preserve"> · sesión de la mañana: bloques A y B, 15:00–17:00 UTC</w:t>
             </w:r>
           </w:p>
           <w:p>
@@ -750,14 +858,14 @@
                 <w:sz w:val="22"/>
                 <w:szCs w:val="22"/>
               </w:rPr>
-              <w:t xml:space="preserve"> · sesión de la tarde: bloques C y D, 14:00–16:00 h (Panamá, UTC−5)</w:t>
+              <w:t xml:space="preserve"> · sesión de la tarde: bloques C y D, 19:00–21:00 UTC</w:t>
             </w:r>
           </w:p>
         </w:tc>
       </w:tr>
       <w:tr>
         <w:trPr>
-          <w:trHeight w:val="3400" w:hRule="atLeast"/>
+          <w:trHeight w:val="2700" w:hRule="atLeast"/>
         </w:trPr>
         <w:tc>
           <w:tcPr>
@@ -921,10 +1029,9 @@
       </w:tr>
     </w:tbl>
     <w:sectPr>
-      <w:headerReference w:type="default" r:id="rId7"/>
-      <w:footerReference w:type="default" r:id="rId8"/>
+      <w:footerReference w:type="default" r:id="rId7"/>
       <w:pgSz w:w="11906" w:h="16838" w:orient="portrait"/>
-      <w:pgMar w:top="1134" w:right="1134" w:bottom="1134" w:left="1134" w:header="708" w:footer="708" w:gutter="0"/>
+      <w:pgMar w:top="900" w:right="1134" w:bottom="1000" w:left="1134" w:header="708" w:footer="708" w:gutter="0"/>
       <w:pgNumType/>
       <w:docGrid w:linePitch="360"/>
     </w:sectPr>
@@ -1027,25 +1134,6 @@
     </w:p>
   </w:footnote>
 </w:footnotes>
-</file>
-
-<file path=word/header1.xml><?xml version="1.0" encoding="utf-8"?>
-<w:hdr xmlns:wpc="http://schemas.microsoft.com/office/word/2010/wordprocessingCanvas" xmlns:mc="http://schemas.openxmlformats.org/markup-compatibility/2006" xmlns:o="urn:schemas-microsoft-com:office:office" xmlns:r="http://schemas.openxmlformats.org/officeDocument/2006/relationships" xmlns:m="http://schemas.openxmlformats.org/officeDocument/2006/math" xmlns:v="urn:schemas-microsoft-com:vml" xmlns:wp14="http://schemas.microsoft.com/office/word/2010/wordprocessingDrawing" xmlns:wp="http://schemas.openxmlformats.org/drawingml/2006/wordprocessingDrawing" xmlns:w10="urn:schemas-microsoft-com:office:word" xmlns:w="http://schemas.openxmlformats.org/wordprocessingml/2006/main" xmlns:w14="http://schemas.microsoft.com/office/word/2010/wordml" xmlns:w15="http://schemas.microsoft.com/office/word/2012/wordml" xmlns:wpg="http://schemas.microsoft.com/office/word/2010/wordprocessingGroup" xmlns:wpi="http://schemas.microsoft.com/office/word/2010/wordprocessingInk" xmlns:wne="http://schemas.microsoft.com/office/word/2006/wordml" xmlns:wps="http://schemas.microsoft.com/office/word/2010/wordprocessingShape" xmlns:cx="http://schemas.microsoft.com/office/drawing/2014/chartex" xmlns:cx1="http://schemas.microsoft.com/office/drawing/2015/9/8/chartex" xmlns:cx2="http://schemas.microsoft.com/office/drawing/2015/10/21/chartex" xmlns:cx3="http://schemas.microsoft.com/office/drawing/2016/5/9/chartex" xmlns:cx4="http://schemas.microsoft.com/office/drawing/2016/5/10/chartex" xmlns:cx5="http://schemas.microsoft.com/office/drawing/2016/5/11/chartex" xmlns:cx6="http://schemas.microsoft.com/office/drawing/2016/5/12/chartex" xmlns:cx7="http://schemas.microsoft.com/office/drawing/2016/5/13/chartex" xmlns:cx8="http://schemas.microsoft.com/office/drawing/2016/5/14/chartex" xmlns:w16cid="http://schemas.microsoft.com/office/word/2016/wordml/cid" xmlns:w16se="http://schemas.microsoft.com/office/word/2015/wordml/symex">
-  <w:p>
-    <w:pPr>
-      <w:jc w:val="right"/>
-    </w:pPr>
-    <w:r>
-      <w:rPr>
-        <w:rFonts w:ascii="Arial" w:cs="Arial" w:eastAsia="Arial" w:hAnsi="Arial"/>
-        <w:color w:val="51636E"/>
-        <w:sz w:val="16"/>
-        <w:szCs w:val="16"/>
-      </w:rPr>
-      <w:t xml:space="preserve">REDLEV · Red Latinoamericana de Ecofisiología Vegetal</w:t>
-    </w:r>
-  </w:p>
-</w:hdr>
 </file>
 
 <file path=word/numbering.xml><?xml version="1.0" encoding="utf-8"?>

</xml_diff>